<commit_message>
Revise plan after mock exam
</commit_message>
<xml_diff>
--- a/06_可直接打开的Word版/00_总览与说明__13_时间线与文件命名说明.docx
+++ b/06_可直接打开的Word版/00_总览与说明__13_时间线与文件命名说明.docx
@@ -3,11 +3,11 @@
 <w:document xmlns:wpc="http://schemas.microsoft.com/office/word/2010/wordprocessingCanvas" xmlns:mo="http://schemas.microsoft.com/office/mac/office/2008/main" xmlns:mc="http://schemas.openxmlformats.org/markup-compatibility/2006" xmlns:mv="urn:schemas-microsoft-com:mac:vml" xmlns:o="urn:schemas-microsoft-com:office:office" xmlns:r="http://schemas.openxmlformats.org/officeDocument/2006/relationships" xmlns:m="http://schemas.openxmlformats.org/officeDocument/2006/math" xmlns:v="urn:schemas-microsoft-com:vml" xmlns:wp14="http://schemas.microsoft.com/office/word/2010/wordprocessingDrawing" xmlns:wp="http://schemas.openxmlformats.org/drawingml/2006/wordprocessingDrawing" xmlns:w10="urn:schemas-microsoft-com:office:word" xmlns:w="http://schemas.openxmlformats.org/wordprocessingml/2006/main" xmlns:w14="http://schemas.microsoft.com/office/word/2010/wordml" xmlns:wpg="http://schemas.microsoft.com/office/word/2010/wordprocessingGroup" xmlns:wpi="http://schemas.microsoft.com/office/word/2010/wordprocessingInk" xmlns:wne="http://schemas.microsoft.com/office/word/2006/wordml" xmlns:wps="http://schemas.microsoft.com/office/word/2010/wordprocessingShape" mc:Ignorable="w14 wp14">
   <w:body>
     <w:p>
-      <w:pPr>
-        <w:pStyle w:val="Heading1"/>
-      </w:pPr>
       <w:r>
-        <w:t>时间线与文件命名说明</w:t>
+        <w:rPr>
+          <w:rFonts w:ascii="Microsoft YaHei" w:hAnsi="Microsoft YaHei" w:eastAsia="Microsoft YaHei"/>
+        </w:rPr>
+        <w:t>﻿# 时间线与文件命名说明</w:t>
       </w:r>
     </w:p>
     <w:p/>
@@ -15,7 +15,6 @@
       <w:r>
         <w:rPr>
           <w:rFonts w:ascii="Microsoft YaHei" w:hAnsi="Microsoft YaHei" w:eastAsia="Microsoft YaHei"/>
-          <w:sz w:val="22"/>
         </w:rPr>
         <w:t>本文件用于统一整个复习包的日期、Day 编号和文件命名，避免新旧计划混用。</w:t>
       </w:r>
@@ -34,7 +33,6 @@
       <w:r>
         <w:rPr>
           <w:rFonts w:ascii="Microsoft YaHei" w:hAnsi="Microsoft YaHei" w:eastAsia="Microsoft YaHei"/>
-          <w:sz w:val="22"/>
         </w:rPr>
         <w:t>当前主计划是：**6月8日模拟考前加速版**。因 2026年6月4日休息一次，当前学习执行进度自 Day07 起整体顺延一天，模拟练习顺延至 2026年6月9日。</w:t>
       </w:r>
@@ -44,7 +42,6 @@
       <w:r>
         <w:rPr>
           <w:rFonts w:ascii="Microsoft YaHei" w:hAnsi="Microsoft YaHei" w:eastAsia="Microsoft YaHei"/>
-          <w:sz w:val="22"/>
         </w:rPr>
         <w:t>以这两个文件为准：</w:t>
       </w:r>
@@ -57,7 +54,6 @@
       <w:r>
         <w:rPr>
           <w:rFonts w:ascii="Microsoft YaHei" w:hAnsi="Microsoft YaHei" w:eastAsia="Microsoft YaHei"/>
-          <w:sz w:val="22"/>
         </w:rPr>
         <w:t>`00_每日执行总表.md`</w:t>
       </w:r>
@@ -69,7 +65,6 @@
       <w:r>
         <w:rPr>
           <w:rFonts w:ascii="Microsoft YaHei" w:hAnsi="Microsoft YaHei" w:eastAsia="Microsoft YaHei"/>
-          <w:sz w:val="22"/>
         </w:rPr>
         <w:t>`12_6月8日模拟考前加速计划.md`</w:t>
       </w:r>
@@ -79,7 +74,6 @@
       <w:r>
         <w:rPr>
           <w:rFonts w:ascii="Microsoft YaHei" w:hAnsi="Microsoft YaHei" w:eastAsia="Microsoft YaHei"/>
-          <w:sz w:val="22"/>
         </w:rPr>
         <w:t>旧版“慢速分章计划”不再作为执行依据。</w:t>
       </w:r>
@@ -98,144 +92,120 @@
       <w:r>
         <w:rPr>
           <w:rFonts w:ascii="Microsoft YaHei" w:hAnsi="Microsoft YaHei" w:eastAsia="Microsoft YaHei"/>
-          <w:sz w:val="22"/>
         </w:rPr>
-        <w:t>| 日期 | 星期 | 标记 | 任务 |</w:t>
+        <w:t>日期 | 星期 | 标记 | 任务</w:t>
       </w:r>
     </w:p>
     <w:p>
       <w:r>
         <w:rPr>
           <w:rFonts w:ascii="Microsoft YaHei" w:hAnsi="Microsoft YaHei" w:eastAsia="Microsoft YaHei"/>
-          <w:sz w:val="22"/>
         </w:rPr>
-        <w:t>|---|---|---|---|</w:t>
+        <w:t>2026年5月28日 | 周四 | Day00 | 准备资料、确认考试范围、安装或确认 SPSS</w:t>
       </w:r>
     </w:p>
     <w:p>
       <w:r>
         <w:rPr>
           <w:rFonts w:ascii="Microsoft YaHei" w:hAnsi="Microsoft YaHei" w:eastAsia="Microsoft YaHei"/>
-          <w:sz w:val="22"/>
         </w:rPr>
-        <w:t>| 2026年5月28日 | 周四 | Day00 | 准备资料、确认考试范围、安装或确认 SPSS |</w:t>
+        <w:t>2026年5月29日 | 周五 | Day01 | 绪论 + SPSS 入门</w:t>
       </w:r>
     </w:p>
     <w:p>
       <w:r>
         <w:rPr>
           <w:rFonts w:ascii="Microsoft YaHei" w:hAnsi="Microsoft YaHei" w:eastAsia="Microsoft YaHei"/>
-          <w:sz w:val="22"/>
         </w:rPr>
-        <w:t>| 2026年5月29日 | 周五 | Day01 | 绪论 + SPSS 入门 |</w:t>
+        <w:t>2026年5月30日 | 周六 | Day02 | 计量资料描述 + 正态分布 + Explore</w:t>
       </w:r>
     </w:p>
     <w:p>
       <w:r>
         <w:rPr>
           <w:rFonts w:ascii="Microsoft YaHei" w:hAnsi="Microsoft YaHei" w:eastAsia="Microsoft YaHei"/>
-          <w:sz w:val="22"/>
         </w:rPr>
-        <w:t>| 2026年5月30日 | 周六 | Day02 | 计量资料描述 + 正态分布 + Explore |</w:t>
+        <w:t>2026年5月31日 | 周日 | Day03 | 参数估计 + 假设检验 + 三种 t 检验</w:t>
       </w:r>
     </w:p>
     <w:p>
       <w:r>
         <w:rPr>
           <w:rFonts w:ascii="Microsoft YaHei" w:hAnsi="Microsoft YaHei" w:eastAsia="Microsoft YaHei"/>
-          <w:sz w:val="22"/>
         </w:rPr>
-        <w:t>| 2026年5月31日 | 周日 | Day03 | 参数估计 + 假设检验 + 三种 t 检验 |</w:t>
+        <w:t>2026年6月1日 | 周一 | Day04 | 方差分析</w:t>
       </w:r>
     </w:p>
     <w:p>
       <w:r>
         <w:rPr>
           <w:rFonts w:ascii="Microsoft YaHei" w:hAnsi="Microsoft YaHei" w:eastAsia="Microsoft YaHei"/>
-          <w:sz w:val="22"/>
         </w:rPr>
-        <w:t>| 2026年6月1日 | 周一 | Day04 | 方差分析 |</w:t>
+        <w:t>2026年6月2日 | 周二 | Day05 | 计数资料 + χ² 检验</w:t>
       </w:r>
     </w:p>
     <w:p>
       <w:r>
         <w:rPr>
           <w:rFonts w:ascii="Microsoft YaHei" w:hAnsi="Microsoft YaHei" w:eastAsia="Microsoft YaHei"/>
-          <w:sz w:val="22"/>
         </w:rPr>
-        <w:t>| 2026年6月2日 | 周二 | Day05 | 计数资料 + χ² 检验 |</w:t>
+        <w:t>2026年6月3日 | 周三 | Day06 | 非参数检验</w:t>
       </w:r>
     </w:p>
     <w:p>
       <w:r>
         <w:rPr>
           <w:rFonts w:ascii="Microsoft YaHei" w:hAnsi="Microsoft YaHei" w:eastAsia="Microsoft YaHei"/>
-          <w:sz w:val="22"/>
         </w:rPr>
-        <w:t>| 2026年6月3日 | 周三 | Day06 | 非参数检验 |</w:t>
+        <w:t>2026年6月5日 | 周五 | Day07 | 相关 + 简单线性回归</w:t>
       </w:r>
     </w:p>
     <w:p>
       <w:r>
         <w:rPr>
           <w:rFonts w:ascii="Microsoft YaHei" w:hAnsi="Microsoft YaHei" w:eastAsia="Microsoft YaHei"/>
-          <w:sz w:val="22"/>
         </w:rPr>
-        <w:t>| 2026年6月5日 | 周五 | Day07 | 相关 + 简单线性回归 |</w:t>
+        <w:t>2026年6月6日 | 周六 | Day08 | 统计表与统计图 + 多元线性回归</w:t>
       </w:r>
     </w:p>
     <w:p>
       <w:r>
         <w:rPr>
           <w:rFonts w:ascii="Microsoft YaHei" w:hAnsi="Microsoft YaHei" w:eastAsia="Microsoft YaHei"/>
-          <w:sz w:val="22"/>
         </w:rPr>
-        <w:t>| 2026年6月6日 | 周六 | Day08 | 统计表与统计图 + 多元线性回归 |</w:t>
+        <w:t>2026年6月7日 | 周日 | Day09 | Logistic 回归 + 实验设计 + SPSS 综合</w:t>
       </w:r>
     </w:p>
     <w:p>
       <w:r>
         <w:rPr>
           <w:rFonts w:ascii="Microsoft YaHei" w:hAnsi="Microsoft YaHei" w:eastAsia="Microsoft YaHei"/>
-          <w:sz w:val="22"/>
         </w:rPr>
-        <w:t>| 2026年6月7日 | 周日 | Day09 | Logistic 回归 + 实验设计 + SPSS 综合 |</w:t>
+        <w:t>2026年6月8日 | 周一 | Day10 | 模拟考前总复盘</w:t>
       </w:r>
     </w:p>
     <w:p>
       <w:r>
         <w:rPr>
           <w:rFonts w:ascii="Microsoft YaHei" w:hAnsi="Microsoft YaHei" w:eastAsia="Microsoft YaHei"/>
-          <w:sz w:val="22"/>
         </w:rPr>
-        <w:t>| 2026年6月8日 | 周一 | Day10 | 模拟考前总复盘 |</w:t>
+        <w:t>2026年6月9日 | 周二 | 模拟考 | 模拟考试，考后记录薄弱点</w:t>
       </w:r>
     </w:p>
     <w:p>
       <w:r>
         <w:rPr>
           <w:rFonts w:ascii="Microsoft YaHei" w:hAnsi="Microsoft YaHei" w:eastAsia="Microsoft YaHei"/>
-          <w:sz w:val="22"/>
         </w:rPr>
-        <w:t>| 2026年6月9日 | 周二 | 模拟考 | 模拟考试，考后记录薄弱点 |</w:t>
+        <w:t>2026年6月10日-6月16日 |  | 二轮复习 | 根据模拟考结果补弱项、二刷错题、机考模拟</w:t>
       </w:r>
     </w:p>
     <w:p>
       <w:r>
         <w:rPr>
           <w:rFonts w:ascii="Microsoft YaHei" w:hAnsi="Microsoft YaHei" w:eastAsia="Microsoft YaHei"/>
-          <w:sz w:val="22"/>
         </w:rPr>
-        <w:t>| 2026年6月10日-6月16日 |  | 二轮复习 | 根据模拟考结果补弱项、二刷错题、机考模拟 |</w:t>
-      </w:r>
-    </w:p>
-    <w:p>
-      <w:r>
-        <w:rPr>
-          <w:rFonts w:ascii="Microsoft YaHei" w:hAnsi="Microsoft YaHei" w:eastAsia="Microsoft YaHei"/>
-          <w:sz w:val="22"/>
-        </w:rPr>
-        <w:t>| 2026年6月17日 | 周三 | 正式考试 | 医学统计学期末考试 |</w:t>
+        <w:t>2026年6月17日 | 周三 | 正式考试 | 医学统计学期末考试</w:t>
       </w:r>
     </w:p>
     <w:p/>
@@ -252,7 +222,6 @@
       <w:r>
         <w:rPr>
           <w:rFonts w:ascii="Microsoft YaHei" w:hAnsi="Microsoft YaHei" w:eastAsia="Microsoft YaHei"/>
-          <w:sz w:val="22"/>
         </w:rPr>
         <w:t>每日笔记：</w:t>
       </w:r>
@@ -262,7 +231,6 @@
       <w:r>
         <w:rPr>
           <w:rFonts w:ascii="Microsoft YaHei" w:hAnsi="Microsoft YaHei" w:eastAsia="Microsoft YaHei"/>
-          <w:sz w:val="22"/>
         </w:rPr>
         <w:t>`DayXX_日期_主题.md`</w:t>
       </w:r>
@@ -272,7 +240,6 @@
       <w:r>
         <w:rPr>
           <w:rFonts w:ascii="Microsoft YaHei" w:hAnsi="Microsoft YaHei" w:eastAsia="Microsoft YaHei"/>
-          <w:sz w:val="22"/>
         </w:rPr>
         <w:t>例：</w:t>
       </w:r>
@@ -285,7 +252,6 @@
       <w:r>
         <w:rPr>
           <w:rFonts w:ascii="Microsoft YaHei" w:hAnsi="Microsoft YaHei" w:eastAsia="Microsoft YaHei"/>
-          <w:sz w:val="22"/>
         </w:rPr>
         <w:t>`Day00_5月28日_准备与考试范围.md`</w:t>
       </w:r>
@@ -297,7 +263,6 @@
       <w:r>
         <w:rPr>
           <w:rFonts w:ascii="Microsoft YaHei" w:hAnsi="Microsoft YaHei" w:eastAsia="Microsoft YaHei"/>
-          <w:sz w:val="22"/>
         </w:rPr>
         <w:t>`Day01_5月29日_绪论与SPSS入门.md`</w:t>
       </w:r>
@@ -309,7 +274,6 @@
       <w:r>
         <w:rPr>
           <w:rFonts w:ascii="Microsoft YaHei" w:hAnsi="Microsoft YaHei" w:eastAsia="Microsoft YaHei"/>
-          <w:sz w:val="22"/>
         </w:rPr>
         <w:t>`Day02_5月30日_计量资料描述与正态分布.md`</w:t>
       </w:r>
@@ -321,7 +285,6 @@
       <w:r>
         <w:rPr>
           <w:rFonts w:ascii="Microsoft YaHei" w:hAnsi="Microsoft YaHei" w:eastAsia="Microsoft YaHei"/>
-          <w:sz w:val="22"/>
         </w:rPr>
         <w:t>`Day03_5月31日_参数估计与三种t检验.md`</w:t>
       </w:r>
@@ -331,7 +294,6 @@
       <w:r>
         <w:rPr>
           <w:rFonts w:ascii="Microsoft YaHei" w:hAnsi="Microsoft YaHei" w:eastAsia="Microsoft YaHei"/>
-          <w:sz w:val="22"/>
         </w:rPr>
         <w:t>错题文件：</w:t>
       </w:r>
@@ -341,7 +303,6 @@
       <w:r>
         <w:rPr>
           <w:rFonts w:ascii="Microsoft YaHei" w:hAnsi="Microsoft YaHei" w:eastAsia="Microsoft YaHei"/>
-          <w:sz w:val="22"/>
         </w:rPr>
         <w:t>`DayXX_主题错题.md`</w:t>
       </w:r>
@@ -351,7 +312,6 @@
       <w:r>
         <w:rPr>
           <w:rFonts w:ascii="Microsoft YaHei" w:hAnsi="Microsoft YaHei" w:eastAsia="Microsoft YaHei"/>
-          <w:sz w:val="22"/>
         </w:rPr>
         <w:t>如果需要保留完整日期，可写成：</w:t>
       </w:r>
@@ -361,7 +321,6 @@
       <w:r>
         <w:rPr>
           <w:rFonts w:ascii="Microsoft YaHei" w:hAnsi="Microsoft YaHei" w:eastAsia="Microsoft YaHei"/>
-          <w:sz w:val="22"/>
         </w:rPr>
         <w:t>`DayXX_YYYY-MM-DD_主题错题.md`</w:t>
       </w:r>
@@ -371,7 +330,6 @@
       <w:r>
         <w:rPr>
           <w:rFonts w:ascii="Microsoft YaHei" w:hAnsi="Microsoft YaHei" w:eastAsia="Microsoft YaHei"/>
-          <w:sz w:val="22"/>
         </w:rPr>
         <w:t>Word 版文件：</w:t>
       </w:r>
@@ -381,7 +339,6 @@
       <w:r>
         <w:rPr>
           <w:rFonts w:ascii="Microsoft YaHei" w:hAnsi="Microsoft YaHei" w:eastAsia="Microsoft YaHei"/>
-          <w:sz w:val="22"/>
         </w:rPr>
         <w:t>放在 `可直接打开的Word版/`，文件名与 Markdown 对应，前面加来源前缀。</w:t>
       </w:r>
@@ -391,7 +348,6 @@
       <w:r>
         <w:rPr>
           <w:rFonts w:ascii="Microsoft YaHei" w:hAnsi="Microsoft YaHei" w:eastAsia="Microsoft YaHei"/>
-          <w:sz w:val="22"/>
         </w:rPr>
         <w:t>例：</w:t>
       </w:r>
@@ -404,7 +360,6 @@
       <w:r>
         <w:rPr>
           <w:rFonts w:ascii="Microsoft YaHei" w:hAnsi="Microsoft YaHei" w:eastAsia="Microsoft YaHei"/>
-          <w:sz w:val="22"/>
         </w:rPr>
         <w:t>`每日笔记__Day03_5月31日_参数估计与三种t检验.docx`</w:t>
       </w:r>
@@ -416,7 +371,6 @@
       <w:r>
         <w:rPr>
           <w:rFonts w:ascii="Microsoft YaHei" w:hAnsi="Microsoft YaHei" w:eastAsia="Microsoft YaHei"/>
-          <w:sz w:val="22"/>
         </w:rPr>
         <w:t>`选择题错题__Day03_参数估计与假设检验错题.docx`</w:t>
       </w:r>
@@ -438,7 +392,6 @@
       <w:r>
         <w:rPr>
           <w:rFonts w:ascii="Microsoft YaHei" w:hAnsi="Microsoft YaHei" w:eastAsia="Microsoft YaHei"/>
-          <w:sz w:val="22"/>
         </w:rPr>
         <w:t>以后不再新建 `.txt` 版本。</w:t>
       </w:r>
@@ -450,7 +403,6 @@
       <w:r>
         <w:rPr>
           <w:rFonts w:ascii="Microsoft YaHei" w:hAnsi="Microsoft YaHei" w:eastAsia="Microsoft YaHei"/>
-          <w:sz w:val="22"/>
         </w:rPr>
         <w:t>`.md` 是编辑源文件，方便后续修改。</w:t>
       </w:r>
@@ -462,7 +414,6 @@
       <w:r>
         <w:rPr>
           <w:rFonts w:ascii="Microsoft YaHei" w:hAnsi="Microsoft YaHei" w:eastAsia="Microsoft YaHei"/>
-          <w:sz w:val="22"/>
         </w:rPr>
         <w:t>`.docx` 是阅读版，方便直接打开。</w:t>
       </w:r>
@@ -474,7 +425,6 @@
       <w:r>
         <w:rPr>
           <w:rFonts w:ascii="Microsoft YaHei" w:hAnsi="Microsoft YaHei" w:eastAsia="Microsoft YaHei"/>
-          <w:sz w:val="22"/>
         </w:rPr>
         <w:t>修改 `.md` 后，需要同步更新对应 `.docx`。</w:t>
       </w:r>
@@ -486,7 +436,6 @@
       <w:r>
         <w:rPr>
           <w:rFonts w:ascii="Microsoft YaHei" w:hAnsi="Microsoft YaHei" w:eastAsia="Microsoft YaHei"/>
-          <w:sz w:val="22"/>
         </w:rPr>
         <w:t>如果 Day 编号和日期冲突，以本文件和 `00_每日执行总表.md` 为准。</w:t>
       </w:r>
@@ -866,7 +815,7 @@
     <w:rsid w:val="00FC693F"/>
     <w:rPr>
       <w:rFonts w:ascii="Microsoft YaHei" w:hAnsi="Microsoft YaHei" w:eastAsia="Microsoft YaHei"/>
-      <w:sz w:val="22"/>
+      <w:sz w:val="21"/>
     </w:rPr>
   </w:style>
   <w:style w:type="paragraph" w:styleId="Header">

</xml_diff>

<commit_message>
Sync final review package updates
</commit_message>
<xml_diff>
--- a/06_可直接打开的Word版/00_总览与说明__13_时间线与文件命名说明.docx
+++ b/06_可直接打开的Word版/00_总览与说明__13_时间线与文件命名说明.docx
@@ -4,18 +4,12 @@
   <w:body>
     <w:p>
       <w:r>
-        <w:rPr>
-          <w:rFonts w:ascii="Microsoft YaHei" w:hAnsi="Microsoft YaHei" w:eastAsia="Microsoft YaHei"/>
-        </w:rPr>
         <w:t>﻿# 时间线与文件命名说明</w:t>
       </w:r>
     </w:p>
     <w:p/>
     <w:p>
       <w:r>
-        <w:rPr>
-          <w:rFonts w:ascii="Microsoft YaHei" w:hAnsi="Microsoft YaHei" w:eastAsia="Microsoft YaHei"/>
-        </w:rPr>
         <w:t>本文件用于统一整个复习包的日期、Day 编号和文件命名，避免新旧计划混用。</w:t>
       </w:r>
     </w:p>
@@ -31,18 +25,12 @@
     <w:p/>
     <w:p>
       <w:r>
-        <w:rPr>
-          <w:rFonts w:ascii="Microsoft YaHei" w:hAnsi="Microsoft YaHei" w:eastAsia="Microsoft YaHei"/>
-        </w:rPr>
-        <w:t>当前主计划是：**6月8日模拟考前加速版**。因 2026年6月4日休息一次，当前学习执行进度自 Day07 起整体顺延一天，模拟练习顺延至 2026年6月9日。</w:t>
+        <w:t>当前主计划是：**6月11日考前极限保分版**。正式考试在 2026年6月17日下午，剩余时间按“SPSS分析大题 + 混合题型检验选择 + 错题回炉”执行，不再按旧章节计划平均复习。</w:t>
       </w:r>
     </w:p>
     <w:p/>
     <w:p>
       <w:r>
-        <w:rPr>
-          <w:rFonts w:ascii="Microsoft YaHei" w:hAnsi="Microsoft YaHei" w:eastAsia="Microsoft YaHei"/>
-        </w:rPr>
         <w:t>以这两个文件为准：</w:t>
       </w:r>
     </w:p>
@@ -52,10 +40,7 @@
         <w:pStyle w:val="ListBullet"/>
       </w:pPr>
       <w:r>
-        <w:rPr>
-          <w:rFonts w:ascii="Microsoft YaHei" w:hAnsi="Microsoft YaHei" w:eastAsia="Microsoft YaHei"/>
-        </w:rPr>
-        <w:t>`00_每日执行总表.md`</w:t>
+        <w:t>`01_计划与每日笔记/00_每日执行总表.md`</w:t>
       </w:r>
     </w:p>
     <w:p>
@@ -63,19 +48,13 @@
         <w:pStyle w:val="ListBullet"/>
       </w:pPr>
       <w:r>
-        <w:rPr>
-          <w:rFonts w:ascii="Microsoft YaHei" w:hAnsi="Microsoft YaHei" w:eastAsia="Microsoft YaHei"/>
-        </w:rPr>
-        <w:t>`12_6月8日模拟考前加速计划.md`</w:t>
+        <w:t>`01_计划与每日笔记/16_6月11日考前极限保分计划.md`</w:t>
       </w:r>
     </w:p>
     <w:p/>
     <w:p>
       <w:r>
-        <w:rPr>
-          <w:rFonts w:ascii="Microsoft YaHei" w:hAnsi="Microsoft YaHei" w:eastAsia="Microsoft YaHei"/>
-        </w:rPr>
-        <w:t>旧版“慢速分章计划”不再作为执行依据。</w:t>
+        <w:t>旧版计划均不再作为执行依据，已归入 `01_计划与每日笔记/历史计划/`。</w:t>
       </w:r>
     </w:p>
     <w:p/>
@@ -91,121 +70,145 @@
     <w:p>
       <w:r>
         <w:rPr>
-          <w:rFonts w:ascii="Microsoft YaHei" w:hAnsi="Microsoft YaHei" w:eastAsia="Microsoft YaHei"/>
+          <w:rFonts w:ascii="Consolas" w:hAnsi="Consolas"/>
+          <w:sz w:val="18"/>
         </w:rPr>
-        <w:t>日期 | 星期 | 标记 | 任务</w:t>
+        <w:t>| 日期 | 星期 | 标记 | 任务 |</w:t>
       </w:r>
     </w:p>
     <w:p>
       <w:r>
         <w:rPr>
-          <w:rFonts w:ascii="Microsoft YaHei" w:hAnsi="Microsoft YaHei" w:eastAsia="Microsoft YaHei"/>
+          <w:rFonts w:ascii="Consolas" w:hAnsi="Consolas"/>
+          <w:sz w:val="18"/>
         </w:rPr>
-        <w:t>2026年5月28日 | 周四 | Day00 | 准备资料、确认考试范围、安装或确认 SPSS</w:t>
+        <w:t>|---|---|---|---|</w:t>
       </w:r>
     </w:p>
     <w:p>
       <w:r>
         <w:rPr>
-          <w:rFonts w:ascii="Microsoft YaHei" w:hAnsi="Microsoft YaHei" w:eastAsia="Microsoft YaHei"/>
+          <w:rFonts w:ascii="Consolas" w:hAnsi="Consolas"/>
+          <w:sz w:val="18"/>
         </w:rPr>
-        <w:t>2026年5月29日 | 周五 | Day01 | 绪论 + SPSS 入门</w:t>
+        <w:t>| 2026年5月28日 | 周四 | Day00 | 准备资料、确认考试范围、安装或确认 SPSS |</w:t>
       </w:r>
     </w:p>
     <w:p>
       <w:r>
         <w:rPr>
-          <w:rFonts w:ascii="Microsoft YaHei" w:hAnsi="Microsoft YaHei" w:eastAsia="Microsoft YaHei"/>
+          <w:rFonts w:ascii="Consolas" w:hAnsi="Consolas"/>
+          <w:sz w:val="18"/>
         </w:rPr>
-        <w:t>2026年5月30日 | 周六 | Day02 | 计量资料描述 + 正态分布 + Explore</w:t>
+        <w:t>| 2026年5月29日 | 周五 | Day01 | 绪论 + SPSS 入门 |</w:t>
       </w:r>
     </w:p>
     <w:p>
       <w:r>
         <w:rPr>
-          <w:rFonts w:ascii="Microsoft YaHei" w:hAnsi="Microsoft YaHei" w:eastAsia="Microsoft YaHei"/>
+          <w:rFonts w:ascii="Consolas" w:hAnsi="Consolas"/>
+          <w:sz w:val="18"/>
         </w:rPr>
-        <w:t>2026年5月31日 | 周日 | Day03 | 参数估计 + 假设检验 + 三种 t 检验</w:t>
+        <w:t>| 2026年5月30日 | 周六 | Day02 | 计量资料描述 + 正态分布 + Explore |</w:t>
       </w:r>
     </w:p>
     <w:p>
       <w:r>
         <w:rPr>
-          <w:rFonts w:ascii="Microsoft YaHei" w:hAnsi="Microsoft YaHei" w:eastAsia="Microsoft YaHei"/>
+          <w:rFonts w:ascii="Consolas" w:hAnsi="Consolas"/>
+          <w:sz w:val="18"/>
         </w:rPr>
-        <w:t>2026年6月1日 | 周一 | Day04 | 方差分析</w:t>
+        <w:t>| 2026年5月31日 | 周日 | Day03 | 参数估计 + 假设检验 + 三种 t 检验 |</w:t>
       </w:r>
     </w:p>
     <w:p>
       <w:r>
         <w:rPr>
-          <w:rFonts w:ascii="Microsoft YaHei" w:hAnsi="Microsoft YaHei" w:eastAsia="Microsoft YaHei"/>
+          <w:rFonts w:ascii="Consolas" w:hAnsi="Consolas"/>
+          <w:sz w:val="18"/>
         </w:rPr>
-        <w:t>2026年6月2日 | 周二 | Day05 | 计数资料 + χ² 检验</w:t>
+        <w:t>| 2026年6月1日 | 周一 | Day04 | 方差分析 |</w:t>
       </w:r>
     </w:p>
     <w:p>
       <w:r>
         <w:rPr>
-          <w:rFonts w:ascii="Microsoft YaHei" w:hAnsi="Microsoft YaHei" w:eastAsia="Microsoft YaHei"/>
+          <w:rFonts w:ascii="Consolas" w:hAnsi="Consolas"/>
+          <w:sz w:val="18"/>
         </w:rPr>
-        <w:t>2026年6月3日 | 周三 | Day06 | 非参数检验</w:t>
+        <w:t>| 2026年6月2日 | 周二 | Day05 | 计数资料 + χ² 检验 |</w:t>
       </w:r>
     </w:p>
     <w:p>
       <w:r>
         <w:rPr>
-          <w:rFonts w:ascii="Microsoft YaHei" w:hAnsi="Microsoft YaHei" w:eastAsia="Microsoft YaHei"/>
+          <w:rFonts w:ascii="Consolas" w:hAnsi="Consolas"/>
+          <w:sz w:val="18"/>
         </w:rPr>
-        <w:t>2026年6月5日 | 周五 | Day07 | 相关 + 简单线性回归</w:t>
+        <w:t>| 2026年6月3日 | 周三 | Day06 | 非参数检验 |</w:t>
       </w:r>
     </w:p>
     <w:p>
       <w:r>
         <w:rPr>
-          <w:rFonts w:ascii="Microsoft YaHei" w:hAnsi="Microsoft YaHei" w:eastAsia="Microsoft YaHei"/>
+          <w:rFonts w:ascii="Consolas" w:hAnsi="Consolas"/>
+          <w:sz w:val="18"/>
         </w:rPr>
-        <w:t>2026年6月6日 | 周六 | Day08 | 统计表与统计图 + 多元线性回归</w:t>
+        <w:t>| 2026年6月5日 | 周五 | Day07 | 相关 + 简单线性回归 |</w:t>
       </w:r>
     </w:p>
     <w:p>
       <w:r>
         <w:rPr>
-          <w:rFonts w:ascii="Microsoft YaHei" w:hAnsi="Microsoft YaHei" w:eastAsia="Microsoft YaHei"/>
+          <w:rFonts w:ascii="Consolas" w:hAnsi="Consolas"/>
+          <w:sz w:val="18"/>
         </w:rPr>
-        <w:t>2026年6月7日 | 周日 | Day09 | Logistic 回归 + 实验设计 + SPSS 综合</w:t>
+        <w:t>| 2026年6月6日 | 周六 | Day08 | 统计表与统计图 + 多元线性回归 |</w:t>
       </w:r>
     </w:p>
     <w:p>
       <w:r>
         <w:rPr>
-          <w:rFonts w:ascii="Microsoft YaHei" w:hAnsi="Microsoft YaHei" w:eastAsia="Microsoft YaHei"/>
+          <w:rFonts w:ascii="Consolas" w:hAnsi="Consolas"/>
+          <w:sz w:val="18"/>
         </w:rPr>
-        <w:t>2026年6月8日 | 周一 | Day10 | 模拟考前总复盘</w:t>
+        <w:t>| 2026年6月7日 | 周日 | Day09 | Logistic 回归 + 实验设计 + SPSS 综合 |</w:t>
       </w:r>
     </w:p>
     <w:p>
       <w:r>
         <w:rPr>
-          <w:rFonts w:ascii="Microsoft YaHei" w:hAnsi="Microsoft YaHei" w:eastAsia="Microsoft YaHei"/>
+          <w:rFonts w:ascii="Consolas" w:hAnsi="Consolas"/>
+          <w:sz w:val="18"/>
         </w:rPr>
-        <w:t>2026年6月9日 | 周二 | 模拟考 | 模拟考试，考后记录薄弱点</w:t>
+        <w:t>| 2026年6月8日 | 周一 | Day10 | 模拟考前总复盘 |</w:t>
       </w:r>
     </w:p>
     <w:p>
       <w:r>
         <w:rPr>
-          <w:rFonts w:ascii="Microsoft YaHei" w:hAnsi="Microsoft YaHei" w:eastAsia="Microsoft YaHei"/>
+          <w:rFonts w:ascii="Consolas" w:hAnsi="Consolas"/>
+          <w:sz w:val="18"/>
         </w:rPr>
-        <w:t>2026年6月10日-6月16日 |  | 二轮复习 | 根据模拟考结果补弱项、二刷错题、机考模拟</w:t>
+        <w:t>| 2026年6月9日 | 周二 | 模拟考 | 模拟考试，考后记录薄弱点 |</w:t>
       </w:r>
     </w:p>
     <w:p>
       <w:r>
         <w:rPr>
-          <w:rFonts w:ascii="Microsoft YaHei" w:hAnsi="Microsoft YaHei" w:eastAsia="Microsoft YaHei"/>
+          <w:rFonts w:ascii="Consolas" w:hAnsi="Consolas"/>
+          <w:sz w:val="18"/>
         </w:rPr>
-        <w:t>2026年6月17日 | 周三 | 正式考试 | 医学统计学期末考试</w:t>
+        <w:t>| 2026年6月10日-6月16日 |  | 二轮复习 | 根据模拟考结果补弱项、二刷错题、机考模拟 |</w:t>
+      </w:r>
+    </w:p>
+    <w:p>
+      <w:r>
+        <w:rPr>
+          <w:rFonts w:ascii="Consolas" w:hAnsi="Consolas"/>
+          <w:sz w:val="18"/>
+        </w:rPr>
+        <w:t>| 2026年6月17日 | 周三 | 正式考试 | 医学统计学期末考试 |</w:t>
       </w:r>
     </w:p>
     <w:p/>
@@ -220,27 +223,18 @@
     <w:p/>
     <w:p>
       <w:r>
-        <w:rPr>
-          <w:rFonts w:ascii="Microsoft YaHei" w:hAnsi="Microsoft YaHei" w:eastAsia="Microsoft YaHei"/>
-        </w:rPr>
         <w:t>每日笔记：</w:t>
       </w:r>
     </w:p>
     <w:p/>
     <w:p>
       <w:r>
-        <w:rPr>
-          <w:rFonts w:ascii="Microsoft YaHei" w:hAnsi="Microsoft YaHei" w:eastAsia="Microsoft YaHei"/>
-        </w:rPr>
         <w:t>`DayXX_日期_主题.md`</w:t>
       </w:r>
     </w:p>
     <w:p/>
     <w:p>
       <w:r>
-        <w:rPr>
-          <w:rFonts w:ascii="Microsoft YaHei" w:hAnsi="Microsoft YaHei" w:eastAsia="Microsoft YaHei"/>
-        </w:rPr>
         <w:t>例：</w:t>
       </w:r>
     </w:p>
@@ -250,9 +244,6 @@
         <w:pStyle w:val="ListBullet"/>
       </w:pPr>
       <w:r>
-        <w:rPr>
-          <w:rFonts w:ascii="Microsoft YaHei" w:hAnsi="Microsoft YaHei" w:eastAsia="Microsoft YaHei"/>
-        </w:rPr>
         <w:t>`Day00_5月28日_准备与考试范围.md`</w:t>
       </w:r>
     </w:p>
@@ -261,9 +252,6 @@
         <w:pStyle w:val="ListBullet"/>
       </w:pPr>
       <w:r>
-        <w:rPr>
-          <w:rFonts w:ascii="Microsoft YaHei" w:hAnsi="Microsoft YaHei" w:eastAsia="Microsoft YaHei"/>
-        </w:rPr>
         <w:t>`Day01_5月29日_绪论与SPSS入门.md`</w:t>
       </w:r>
     </w:p>
@@ -272,9 +260,6 @@
         <w:pStyle w:val="ListBullet"/>
       </w:pPr>
       <w:r>
-        <w:rPr>
-          <w:rFonts w:ascii="Microsoft YaHei" w:hAnsi="Microsoft YaHei" w:eastAsia="Microsoft YaHei"/>
-        </w:rPr>
         <w:t>`Day02_5月30日_计量资料描述与正态分布.md`</w:t>
       </w:r>
     </w:p>
@@ -283,72 +268,48 @@
         <w:pStyle w:val="ListBullet"/>
       </w:pPr>
       <w:r>
-        <w:rPr>
-          <w:rFonts w:ascii="Microsoft YaHei" w:hAnsi="Microsoft YaHei" w:eastAsia="Microsoft YaHei"/>
-        </w:rPr>
         <w:t>`Day03_5月31日_参数估计与三种t检验.md`</w:t>
       </w:r>
     </w:p>
     <w:p/>
     <w:p>
       <w:r>
-        <w:rPr>
-          <w:rFonts w:ascii="Microsoft YaHei" w:hAnsi="Microsoft YaHei" w:eastAsia="Microsoft YaHei"/>
-        </w:rPr>
         <w:t>错题文件：</w:t>
       </w:r>
     </w:p>
     <w:p/>
     <w:p>
       <w:r>
-        <w:rPr>
-          <w:rFonts w:ascii="Microsoft YaHei" w:hAnsi="Microsoft YaHei" w:eastAsia="Microsoft YaHei"/>
-        </w:rPr>
         <w:t>`DayXX_主题错题.md`</w:t>
       </w:r>
     </w:p>
     <w:p/>
     <w:p>
       <w:r>
-        <w:rPr>
-          <w:rFonts w:ascii="Microsoft YaHei" w:hAnsi="Microsoft YaHei" w:eastAsia="Microsoft YaHei"/>
-        </w:rPr>
         <w:t>如果需要保留完整日期，可写成：</w:t>
       </w:r>
     </w:p>
     <w:p/>
     <w:p>
       <w:r>
-        <w:rPr>
-          <w:rFonts w:ascii="Microsoft YaHei" w:hAnsi="Microsoft YaHei" w:eastAsia="Microsoft YaHei"/>
-        </w:rPr>
         <w:t>`DayXX_YYYY-MM-DD_主题错题.md`</w:t>
       </w:r>
     </w:p>
     <w:p/>
     <w:p>
       <w:r>
-        <w:rPr>
-          <w:rFonts w:ascii="Microsoft YaHei" w:hAnsi="Microsoft YaHei" w:eastAsia="Microsoft YaHei"/>
-        </w:rPr>
         <w:t>Word 版文件：</w:t>
       </w:r>
     </w:p>
     <w:p/>
     <w:p>
       <w:r>
-        <w:rPr>
-          <w:rFonts w:ascii="Microsoft YaHei" w:hAnsi="Microsoft YaHei" w:eastAsia="Microsoft YaHei"/>
-        </w:rPr>
         <w:t>放在 `可直接打开的Word版/`，文件名与 Markdown 对应，前面加来源前缀。</w:t>
       </w:r>
     </w:p>
     <w:p/>
     <w:p>
       <w:r>
-        <w:rPr>
-          <w:rFonts w:ascii="Microsoft YaHei" w:hAnsi="Microsoft YaHei" w:eastAsia="Microsoft YaHei"/>
-        </w:rPr>
         <w:t>例：</w:t>
       </w:r>
     </w:p>
@@ -358,9 +319,6 @@
         <w:pStyle w:val="ListBullet"/>
       </w:pPr>
       <w:r>
-        <w:rPr>
-          <w:rFonts w:ascii="Microsoft YaHei" w:hAnsi="Microsoft YaHei" w:eastAsia="Microsoft YaHei"/>
-        </w:rPr>
         <w:t>`每日笔记__Day03_5月31日_参数估计与三种t检验.docx`</w:t>
       </w:r>
     </w:p>
@@ -369,9 +327,6 @@
         <w:pStyle w:val="ListBullet"/>
       </w:pPr>
       <w:r>
-        <w:rPr>
-          <w:rFonts w:ascii="Microsoft YaHei" w:hAnsi="Microsoft YaHei" w:eastAsia="Microsoft YaHei"/>
-        </w:rPr>
         <w:t>`选择题错题__Day03_参数估计与假设检验错题.docx`</w:t>
       </w:r>
     </w:p>
@@ -390,20 +345,6 @@
         <w:pStyle w:val="ListNumber"/>
       </w:pPr>
       <w:r>
-        <w:rPr>
-          <w:rFonts w:ascii="Microsoft YaHei" w:hAnsi="Microsoft YaHei" w:eastAsia="Microsoft YaHei"/>
-        </w:rPr>
-        <w:t>以后不再新建 `.txt` 版本。</w:t>
-      </w:r>
-    </w:p>
-    <w:p>
-      <w:pPr>
-        <w:pStyle w:val="ListNumber"/>
-      </w:pPr>
-      <w:r>
-        <w:rPr>
-          <w:rFonts w:ascii="Microsoft YaHei" w:hAnsi="Microsoft YaHei" w:eastAsia="Microsoft YaHei"/>
-        </w:rPr>
         <w:t>`.md` 是编辑源文件，方便后续修改。</w:t>
       </w:r>
     </w:p>
@@ -412,10 +353,7 @@
         <w:pStyle w:val="ListNumber"/>
       </w:pPr>
       <w:r>
-        <w:rPr>
-          <w:rFonts w:ascii="Microsoft YaHei" w:hAnsi="Microsoft YaHei" w:eastAsia="Microsoft YaHei"/>
-        </w:rPr>
-        <w:t>`.docx` 是阅读版，方便直接打开。</w:t>
+        <w:t>`.docx` 是阅读版，统一放入 `06_可直接打开的Word版/`。</w:t>
       </w:r>
     </w:p>
     <w:p>
@@ -423,10 +361,7 @@
         <w:pStyle w:val="ListNumber"/>
       </w:pPr>
       <w:r>
-        <w:rPr>
-          <w:rFonts w:ascii="Microsoft YaHei" w:hAnsi="Microsoft YaHei" w:eastAsia="Microsoft YaHei"/>
-        </w:rPr>
-        <w:t>修改 `.md` 后，需要同步更新对应 `.docx`。</w:t>
+        <w:t>`.txt` 是纯文本备份，统一放入 `07_可直接打开的TXT版/`。</w:t>
       </w:r>
     </w:p>
     <w:p>
@@ -434,10 +369,15 @@
         <w:pStyle w:val="ListNumber"/>
       </w:pPr>
       <w:r>
-        <w:rPr>
-          <w:rFonts w:ascii="Microsoft YaHei" w:hAnsi="Microsoft YaHei" w:eastAsia="Microsoft YaHei"/>
-        </w:rPr>
-        <w:t>如果 Day 编号和日期冲突，以本文件和 `00_每日执行总表.md` 为准。</w:t>
+        <w:t>修改重要 `.md` 后，需要同步更新对应 `.docx` 和 `.txt`。</w:t>
+      </w:r>
+    </w:p>
+    <w:p>
+      <w:pPr>
+        <w:pStyle w:val="ListNumber"/>
+      </w:pPr>
+      <w:r>
+        <w:t>如果 Day 编号和日期冲突，以本文件和 `01_计划与每日笔记/00_每日执行总表.md` 为准。</w:t>
       </w:r>
     </w:p>
     <w:sectPr>
@@ -814,7 +754,7 @@
     <w:qFormat/>
     <w:rsid w:val="00FC693F"/>
     <w:rPr>
-      <w:rFonts w:ascii="Microsoft YaHei" w:hAnsi="Microsoft YaHei" w:eastAsia="Microsoft YaHei"/>
+      <w:rFonts w:ascii="Microsoft YaHei" w:hAnsi="Microsoft YaHei"/>
       <w:sz w:val="21"/>
     </w:rPr>
   </w:style>

</xml_diff>